<commit_message>
Remove CyberSoft certificate, link IELTS to the language section on quannh.xyz, regenerate PDF
Co-Authored-By: Claude Opus 5.5 <noreply@anthropic.com>
</commit_message>
<xml_diff>
--- a/CV - Nguyen Hoang Quan.docx
+++ b/CV - Nguyen Hoang Quan.docx
@@ -1524,37 +1524,7 @@
             <w:r>
               <w:t xml:space="preserve"> – Overall 6.5 (December 15, 2025) – </w:t>
             </w:r>
-            <w:hyperlink r:id="rId20" w:tooltip="https://quannh.xyz" w:history="1">
-              <w:r>
-                <w:rPr>
-                  <w:rStyle w:val="905"/>
-                  <w:color w:val="000000"/>
-                  <w:u w:val="none"/>
-                </w:rPr>
-                <w:t xml:space="preserve">view</w:t>
-              </w:r>
-            </w:hyperlink>
-            <w:r/>
-            <w:r/>
-          </w:p>
-          <w:p>
-            <w:pPr>
-              <w:pBdr/>
-              <w:spacing w:after="39" w:before="39" w:line="276" w:lineRule="auto"/>
-              <w:ind w:left="0"/>
-              <w:rPr/>
-            </w:pPr>
-            <w:r>
-              <w:rPr>
-                <w:b/>
-                <w:bCs/>
-              </w:rPr>
-              <w:t xml:space="preserve">Front-End Foundation Developer</w:t>
-            </w:r>
-            <w:r>
-              <w:t xml:space="preserve"> – CyberSoft – </w:t>
-            </w:r>
-            <w:hyperlink r:id="rId21" w:tooltip="https://quannh.xyz" w:history="1">
+            <w:hyperlink r:id="rId20" w:tooltip="https://quannh.xyz/#language" w:history="1">
               <w:r>
                 <w:rPr>
                   <w:rStyle w:val="905"/>

</xml_diff>